<commit_message>
Update specs for bonus
</commit_message>
<xml_diff>
--- a/3. AltWeb Assignment 2.docx
+++ b/3. AltWeb Assignment 2.docx
@@ -113,25 +113,7 @@
           <w:szCs w:val="24"/>
           <w:lang w:val="en-US"/>
         </w:rPr>
-        <w:t xml:space="preserve">Create </w:t>
-      </w:r>
-      <w:proofErr w:type="spellStart"/>
-      <w:r>
-        <w:rPr>
-          <w:sz w:val="24"/>
-          <w:szCs w:val="24"/>
-          <w:lang w:val="en-US"/>
-        </w:rPr>
-        <w:t>TypeScripts</w:t>
-      </w:r>
-      <w:proofErr w:type="spellEnd"/>
-      <w:r>
-        <w:rPr>
-          <w:sz w:val="24"/>
-          <w:szCs w:val="24"/>
-          <w:lang w:val="en-US"/>
-        </w:rPr>
-        <w:t xml:space="preserve"> that contains the specified interface, parent and child classes as per the class diagram</w:t>
+        <w:t>Create TypeScripts that contains the specified interface, parent and child classes as per the class diagram</w:t>
       </w:r>
     </w:p>
     <w:p>
@@ -169,7 +151,6 @@
           <w:lang w:val="en-US"/>
         </w:rPr>
       </w:pPr>
-      <w:proofErr w:type="spellStart"/>
       <w:r>
         <w:rPr>
           <w:sz w:val="24"/>
@@ -178,7 +159,6 @@
         </w:rPr>
         <w:t>displayInformation</w:t>
       </w:r>
-      <w:proofErr w:type="spellEnd"/>
     </w:p>
     <w:p>
       <w:pPr>
@@ -215,7 +195,6 @@
           <w:lang w:val="en-US"/>
         </w:rPr>
       </w:pPr>
-      <w:proofErr w:type="spellStart"/>
       <w:r>
         <w:rPr>
           <w:sz w:val="24"/>
@@ -224,7 +203,6 @@
         </w:rPr>
         <w:t>calculateCompensation</w:t>
       </w:r>
-      <w:proofErr w:type="spellEnd"/>
     </w:p>
     <w:p>
       <w:pPr>
@@ -261,7 +239,6 @@
           <w:lang w:val="en-US"/>
         </w:rPr>
       </w:pPr>
-      <w:proofErr w:type="spellStart"/>
       <w:r>
         <w:rPr>
           <w:sz w:val="24"/>
@@ -270,7 +247,6 @@
         </w:rPr>
         <w:t>saveEmployee</w:t>
       </w:r>
-      <w:proofErr w:type="spellEnd"/>
     </w:p>
     <w:p>
       <w:pPr>
@@ -431,25 +407,7 @@
           <w:szCs w:val="24"/>
           <w:lang w:val="en-US"/>
         </w:rPr>
-        <w:t xml:space="preserve">The SSN must match the pattern: ###-###-### (Use </w:t>
-      </w:r>
-      <w:proofErr w:type="spellStart"/>
-      <w:r>
-        <w:rPr>
-          <w:sz w:val="24"/>
-          <w:szCs w:val="24"/>
-          <w:lang w:val="en-US"/>
-        </w:rPr>
-        <w:t>RegEx</w:t>
-      </w:r>
-      <w:proofErr w:type="spellEnd"/>
-      <w:r>
-        <w:rPr>
-          <w:sz w:val="24"/>
-          <w:szCs w:val="24"/>
-          <w:lang w:val="en-US"/>
-        </w:rPr>
-        <w:t>)</w:t>
+        <w:t>The SSN must match the pattern: ###-###-### (Use RegEx)</w:t>
       </w:r>
     </w:p>
     <w:p>
@@ -493,25 +451,7 @@
           <w:szCs w:val="24"/>
           <w:lang w:val="en-US"/>
         </w:rPr>
-        <w:t xml:space="preserve">The Fulltime Employee Compensation is calculated with the following business rules within the </w:t>
-      </w:r>
-      <w:proofErr w:type="spellStart"/>
-      <w:r>
-        <w:rPr>
-          <w:sz w:val="24"/>
-          <w:szCs w:val="24"/>
-          <w:lang w:val="en-US"/>
-        </w:rPr>
-        <w:t>calculateSalary</w:t>
-      </w:r>
-      <w:proofErr w:type="spellEnd"/>
-      <w:r>
-        <w:rPr>
-          <w:sz w:val="24"/>
-          <w:szCs w:val="24"/>
-          <w:lang w:val="en-US"/>
-        </w:rPr>
-        <w:t xml:space="preserve"> method:</w:t>
+        <w:t>The Fulltime Employee Compensation is calculated with the following business rules within the calculateSalary method:</w:t>
       </w:r>
     </w:p>
     <w:p>
@@ -599,43 +539,7 @@
           <w:szCs w:val="24"/>
           <w:lang w:val="en-US"/>
         </w:rPr>
-        <w:t xml:space="preserve">Overtime hours greater than 30 are paid at 2 times the hourly rate ((Salary/40 </w:t>
-      </w:r>
-      <w:proofErr w:type="spellStart"/>
-      <w:r>
-        <w:rPr>
-          <w:sz w:val="24"/>
-          <w:szCs w:val="24"/>
-          <w:lang w:val="en-US"/>
-        </w:rPr>
-        <w:t>Hrs</w:t>
-      </w:r>
-      <w:proofErr w:type="spellEnd"/>
-      <w:r>
-        <w:rPr>
-          <w:sz w:val="24"/>
-          <w:szCs w:val="24"/>
-          <w:lang w:val="en-US"/>
-        </w:rPr>
-        <w:t xml:space="preserve">) * OT </w:t>
-      </w:r>
-      <w:proofErr w:type="spellStart"/>
-      <w:r>
-        <w:rPr>
-          <w:sz w:val="24"/>
-          <w:szCs w:val="24"/>
-          <w:lang w:val="en-US"/>
-        </w:rPr>
-        <w:t>Hrs</w:t>
-      </w:r>
-      <w:proofErr w:type="spellEnd"/>
-      <w:r>
-        <w:rPr>
-          <w:sz w:val="24"/>
-          <w:szCs w:val="24"/>
-          <w:lang w:val="en-US"/>
-        </w:rPr>
-        <w:t xml:space="preserve"> * 2)</w:t>
+        <w:t>Overtime hours greater than 30 are paid at 2 times the hourly rate ((Salary/40 Hrs) * OT Hrs * 2)</w:t>
       </w:r>
     </w:p>
     <w:p>
@@ -657,25 +561,25 @@
           <w:szCs w:val="24"/>
           <w:lang w:val="en-US"/>
         </w:rPr>
-        <w:t>Overtime is added to the base salary when calculating the total compensation (</w:t>
-      </w:r>
-      <w:proofErr w:type="spellStart"/>
-      <w:r>
-        <w:rPr>
-          <w:sz w:val="24"/>
-          <w:szCs w:val="24"/>
-          <w:lang w:val="en-US"/>
-        </w:rPr>
-        <w:t>calculateCompensation</w:t>
-      </w:r>
-      <w:proofErr w:type="spellEnd"/>
-      <w:r>
-        <w:rPr>
-          <w:sz w:val="24"/>
-          <w:szCs w:val="24"/>
-          <w:lang w:val="en-US"/>
-        </w:rPr>
-        <w:t>)</w:t>
+        <w:t xml:space="preserve">Overtime </w:t>
+      </w:r>
+      <w:r>
+        <w:rPr>
+          <w:sz w:val="24"/>
+          <w:szCs w:val="24"/>
+          <w:lang w:val="en-US"/>
+        </w:rPr>
+        <w:t>and bonus are</w:t>
+      </w:r>
+      <w:bookmarkStart w:id="0" w:name="_GoBack"/>
+      <w:bookmarkEnd w:id="0"/>
+      <w:r>
+        <w:rPr>
+          <w:sz w:val="24"/>
+          <w:szCs w:val="24"/>
+          <w:lang w:val="en-US"/>
+        </w:rPr>
+        <w:t xml:space="preserve"> added to the base salary when calculating the total compensation (calculateCompensation)</w:t>
       </w:r>
     </w:p>
     <w:p>
@@ -700,23 +604,13 @@
         <w:lastRenderedPageBreak/>
         <w:t xml:space="preserve">The Contract Employee Compensation is calculated with the following business rules within the </w:t>
       </w:r>
-      <w:proofErr w:type="spellStart"/>
-      <w:r>
-        <w:rPr>
-          <w:sz w:val="24"/>
-          <w:szCs w:val="24"/>
-          <w:lang w:val="en-US"/>
-        </w:rPr>
-        <w:t>calculateCompensation</w:t>
-      </w:r>
-      <w:proofErr w:type="spellEnd"/>
-      <w:r>
-        <w:rPr>
-          <w:sz w:val="24"/>
-          <w:szCs w:val="24"/>
-          <w:lang w:val="en-US"/>
-        </w:rPr>
-        <w:t xml:space="preserve"> </w:t>
+      <w:r>
+        <w:rPr>
+          <w:sz w:val="24"/>
+          <w:szCs w:val="24"/>
+          <w:lang w:val="en-US"/>
+        </w:rPr>
+        <w:t xml:space="preserve">calculateCompensation </w:t>
       </w:r>
       <w:r>
         <w:rPr>
@@ -790,43 +684,7 @@
           <w:szCs w:val="24"/>
           <w:lang w:val="en-US"/>
         </w:rPr>
-        <w:t>Rate of $30/</w:t>
-      </w:r>
-      <w:proofErr w:type="spellStart"/>
-      <w:r>
-        <w:rPr>
-          <w:sz w:val="24"/>
-          <w:szCs w:val="24"/>
-          <w:lang w:val="en-US"/>
-        </w:rPr>
-        <w:t>hr</w:t>
-      </w:r>
-      <w:proofErr w:type="spellEnd"/>
-      <w:r>
-        <w:rPr>
-          <w:sz w:val="24"/>
-          <w:szCs w:val="24"/>
-          <w:lang w:val="en-US"/>
-        </w:rPr>
-        <w:t xml:space="preserve"> for the first 40 hours, $45/</w:t>
-      </w:r>
-      <w:proofErr w:type="spellStart"/>
-      <w:r>
-        <w:rPr>
-          <w:sz w:val="24"/>
-          <w:szCs w:val="24"/>
-          <w:lang w:val="en-US"/>
-        </w:rPr>
-        <w:t>hr</w:t>
-      </w:r>
-      <w:proofErr w:type="spellEnd"/>
-      <w:r>
-        <w:rPr>
-          <w:sz w:val="24"/>
-          <w:szCs w:val="24"/>
-          <w:lang w:val="en-US"/>
-        </w:rPr>
-        <w:t xml:space="preserve"> for all hours beyond 40</w:t>
+        <w:t>Rate of $30/hr for the first 40 hours, $45/hr for all hours beyond 40</w:t>
       </w:r>
     </w:p>
     <w:p>
@@ -892,25 +750,7 @@
           <w:szCs w:val="24"/>
           <w:lang w:val="en-US"/>
         </w:rPr>
-        <w:t xml:space="preserve">Calles the </w:t>
-      </w:r>
-      <w:proofErr w:type="spellStart"/>
-      <w:r>
-        <w:rPr>
-          <w:sz w:val="24"/>
-          <w:szCs w:val="24"/>
-          <w:lang w:val="en-US"/>
-        </w:rPr>
-        <w:t>saveEmployee</w:t>
-      </w:r>
-      <w:proofErr w:type="spellEnd"/>
-      <w:r>
-        <w:rPr>
-          <w:sz w:val="24"/>
-          <w:szCs w:val="24"/>
-          <w:lang w:val="en-US"/>
-        </w:rPr>
-        <w:t xml:space="preserve"> and within the save executes the validation of Age, Rank and SSN</w:t>
+        <w:t>Calles the saveEmployee and within the save executes the validation of Age, Rank and SSN</w:t>
       </w:r>
     </w:p>
     <w:p>
@@ -932,18 +772,8 @@
           <w:szCs w:val="24"/>
           <w:lang w:val="en-US"/>
         </w:rPr>
-        <w:t xml:space="preserve">A valid save state of each employee type will the display the details for the fulltime and contract employees by calling </w:t>
-      </w:r>
-      <w:proofErr w:type="spellStart"/>
-      <w:r>
-        <w:rPr>
-          <w:sz w:val="24"/>
-          <w:szCs w:val="24"/>
-          <w:lang w:val="en-US"/>
-        </w:rPr>
-        <w:t>displayInformation</w:t>
-      </w:r>
-      <w:proofErr w:type="spellEnd"/>
+        <w:t>A valid save state of each employee type will the display the details for the fulltime and contract employees by calling displayInformation</w:t>
+      </w:r>
     </w:p>
     <w:p>
       <w:pPr>
@@ -966,8 +796,6 @@
         </w:rPr>
         <w:t>Create one employee object that fails the validation checks for Age, Rank and SSN to test the validations</w:t>
       </w:r>
-      <w:bookmarkStart w:id="0" w:name="_GoBack"/>
-      <w:bookmarkEnd w:id="0"/>
     </w:p>
     <w:p>
       <w:pPr>
@@ -1014,7 +842,7 @@
             <v:path o:extrusionok="f" gradientshapeok="t" o:connecttype="rect"/>
             <o:lock v:ext="edit" aspectratio="t"/>
           </v:shapetype>
-          <v:shape id="_x0000_i1025" type="#_x0000_t75" style="width:441.2pt;height:570.15pt">
+          <v:shape id="_x0000_i1025" type="#_x0000_t75" style="width:441.75pt;height:570pt">
             <v:imagedata r:id="rId7" o:title="Employee Class Diagram"/>
           </v:shape>
         </w:pict>

</xml_diff>